<commit_message>
fixed the docs file
</commit_message>
<xml_diff>
--- a/Project-docs.docx
+++ b/Project-docs.docx
@@ -1516,16 +1516,6 @@
                 <w14:ligatures w14:val="none"/>
               </w:rPr>
             </w:pPr>
-            <w:r>
-              <w:rPr>
-                <w:rFonts w:ascii="Arial" w:hAnsi="Arial" w:eastAsia="Arial" w:cs="Arial"/>
-                <w:color w:val="1f1f1f"/>
-                <w:sz w:val="22"/>
-                <w:szCs w:val="22"/>
-                <w14:ligatures w14:val="none"/>
-              </w:rPr>
-              <w:t xml:space="preserve">Бүртгэл шаарддаггүй, өгөгдөл нь түр зуурын шинжтэй.</w:t>
-            </w:r>
             <w:r>
               <w:rPr>
                 <w:rFonts w:ascii="Arial" w:hAnsi="Arial" w:cs="Arial"/>

</xml_diff>